<commit_message>
Align seminar title page, headings and TOC with course guidelines
Co-Authored-By: Claude Fable 5.1 <noreply@anthropic.com>
Claude-Session: https://claude.ai/code/session_019RaBW72rT1xkbcXD9zJSh3
</commit_message>
<xml_diff>
--- a/seminar/עבודה_סמינריונית_מלאה_מסכים_שינה_פעילות_גופנית_לקויות_למידה.docx
+++ b/seminar/עבודה_סמינריונית_מלאה_מסכים_שינה_פעילות_גופנית_לקויות_למידה.docx
@@ -104,11 +104,11 @@
           <w:rFonts w:ascii="Times New Roman" w:cs="David" w:eastAsia="David" w:hAnsi="Times New Roman"/>
           <w:b/>
           <w:bCs/>
-          <w:sz w:val="26"/>
-          <w:szCs w:val="26"/>
-          <w:rtl/>
-        </w:rPr>
-        <w:t xml:space="preserve">סמינריון בלקויות למידה</w:t>
+          <w:sz w:val="24"/>
+          <w:szCs w:val="24"/>
+          <w:rtl/>
+        </w:rPr>
+        <w:t xml:space="preserve">עבודה סמינריונית במסגרת הקורס: סמינריון בלקויות למידה</w:t>
       </w:r>
     </w:p>
     <w:p>
@@ -300,29 +300,7 @@
           <w:szCs w:val="24"/>
           <w:rtl/>
         </w:rPr>
-        <w:t xml:space="preserve">כתובת: [כתובת]    טלפון: [מספר טלפון]</w:t>
-      </w:r>
-    </w:p>
-    <w:p>
-      <w:r>
-        <w:rPr>
-          <w:rFonts w:ascii="Times New Roman" w:cs="David" w:eastAsia="David" w:hAnsi="Times New Roman"/>
-          <w:sz w:val="24"/>
-          <w:szCs w:val="24"/>
-          <w:rtl/>
-        </w:rPr>
-        <w:t xml:space="preserve"/>
-      </w:r>
-    </w:p>
-    <w:p>
-      <w:r>
-        <w:rPr>
-          <w:rFonts w:ascii="Times New Roman" w:cs="David" w:eastAsia="David" w:hAnsi="Times New Roman"/>
-          <w:sz w:val="24"/>
-          <w:szCs w:val="24"/>
-          <w:rtl/>
-        </w:rPr>
-        <w:t xml:space="preserve"/>
+        <w:t xml:space="preserve">כתובת: [כתובת מלאה]</w:t>
       </w:r>
     </w:p>
     <w:p>
@@ -340,7 +318,47 @@
           <w:szCs w:val="24"/>
           <w:rtl/>
         </w:rPr>
-        <w:t xml:space="preserve">[חודש] תשפ"ז, [חודש] 2026</w:t>
+        <w:t xml:space="preserve">טלפון: [מספר טלפון]</w:t>
+      </w:r>
+    </w:p>
+    <w:p>
+      <w:r>
+        <w:rPr>
+          <w:rFonts w:ascii="Times New Roman" w:cs="David" w:eastAsia="David" w:hAnsi="Times New Roman"/>
+          <w:sz w:val="24"/>
+          <w:szCs w:val="24"/>
+          <w:rtl/>
+        </w:rPr>
+        <w:t xml:space="preserve"/>
+      </w:r>
+    </w:p>
+    <w:p>
+      <w:r>
+        <w:rPr>
+          <w:rFonts w:ascii="Times New Roman" w:cs="David" w:eastAsia="David" w:hAnsi="Times New Roman"/>
+          <w:sz w:val="24"/>
+          <w:szCs w:val="24"/>
+          <w:rtl/>
+        </w:rPr>
+        <w:t xml:space="preserve"/>
+      </w:r>
+    </w:p>
+    <w:p>
+      <w:pPr>
+        <w:bidi/>
+        <w:spacing w:after="120" w:line="360"/>
+        <w:jc w:val="center"/>
+      </w:pPr>
+      <w:r>
+        <w:rPr>
+          <w:rFonts w:ascii="Times New Roman" w:cs="David" w:eastAsia="David" w:hAnsi="Times New Roman"/>
+          <w:b w:val="false"/>
+          <w:bCs w:val="false"/>
+          <w:sz w:val="24"/>
+          <w:szCs w:val="24"/>
+          <w:rtl/>
+        </w:rPr>
+        <w:t xml:space="preserve">תאריך הגשה: [יום בחודש] [חודש] 2026, [תאריך עברי]</w:t>
       </w:r>
     </w:p>
     <w:p>
@@ -376,7 +394,7 @@
         <w:p>
           <w:r>
             <w:fldChar w:fldCharType="begin" w:dirty="true"/>
-            <w:instrText xml:space="preserve">TOC \h \o "1-2"</w:instrText>
+            <w:instrText xml:space="preserve">TOC \h \o "1-3"</w:instrText>
             <w:fldChar w:fldCharType="separate"/>
           </w:r>
         </w:p>
@@ -390,17 +408,18 @@
     <w:p>
       <w:pPr>
         <w:bidi/>
-        <w:spacing w:after="120" w:line="360"/>
         <w:jc w:val="right"/>
       </w:pPr>
       <w:r>
         <w:rPr>
           <w:rFonts w:ascii="Times New Roman" w:cs="David" w:eastAsia="David" w:hAnsi="Times New Roman"/>
-          <w:sz w:val="24"/>
-          <w:szCs w:val="24"/>
-          <w:rtl/>
-        </w:rPr>
-        <w:t xml:space="preserve">(לעדכון תוכן העניינים ומספרי העמודים: לחיצה ימנית על הטבלה ובחירה ב"עדכן שדה", או F9)</w:t>
+          <w:i/>
+          <w:iCs/>
+          <w:sz w:val="18"/>
+          <w:szCs w:val="18"/>
+          <w:rtl/>
+        </w:rPr>
+        <w:t xml:space="preserve">(מספרי העמודים מתעדכנים אוטומטית בפתיחת הקובץ בוורד. אם וורד שואל אם לעדכן שדות, לבחור "כן". לעדכון ידני: לחיצה ימנית על תוכן העניינים ובחירה ב"עדכן שדה". למחוק שורה זו לפני ההגשה.)</w:t>
       </w:r>
     </w:p>
     <w:p>
@@ -535,7 +554,7 @@
           <w:szCs w:val="32"/>
           <w:rtl/>
         </w:rPr>
-        <w:t xml:space="preserve">פרק 1: סקירת ספרות</w:t>
+        <w:t xml:space="preserve">פרק 1: סקירת הספרות</w:t>
       </w:r>
     </w:p>
     <w:p>
@@ -1952,7 +1971,7 @@
           <w:szCs w:val="32"/>
           <w:rtl/>
         </w:rPr>
-        <w:t xml:space="preserve">פרק 3: ממצאים</w:t>
+        <w:t xml:space="preserve">פרק 3: ממצאים (תוצאות)</w:t>
       </w:r>
     </w:p>
     <w:p>
@@ -11232,7 +11251,7 @@
           <w:szCs w:val="32"/>
           <w:rtl/>
         </w:rPr>
-        <w:t xml:space="preserve">רשימת מקורות</w:t>
+        <w:t xml:space="preserve">ביבליוגרפיה</w:t>
       </w:r>
     </w:p>
     <w:p>
@@ -11810,6 +11829,26 @@
           <w:color w:val="000000"/>
           <w:sz w:val="32"/>
           <w:szCs w:val="32"/>
+          <w:rtl/>
+        </w:rPr>
+        <w:t xml:space="preserve">נספחים</w:t>
+      </w:r>
+    </w:p>
+    <w:p>
+      <w:pPr>
+        <w:pStyle w:val="Heading2"/>
+        <w:bidi/>
+        <w:spacing w:after="120" w:before="240" w:line="360"/>
+        <w:jc w:val="right"/>
+      </w:pPr>
+      <w:r>
+        <w:rPr>
+          <w:rFonts w:ascii="Times New Roman" w:cs="David" w:eastAsia="David" w:hAnsi="Times New Roman"/>
+          <w:b/>
+          <w:bCs/>
+          <w:color w:val="000000"/>
+          <w:sz w:val="28"/>
+          <w:szCs w:val="28"/>
           <w:rtl/>
         </w:rPr>
         <w:t xml:space="preserve">נספח א': שאלון המחקר</w:t>

</xml_diff>